<commit_message>
se agrego estilo al formato 2
</commit_message>
<xml_diff>
--- a/src/assets/PlantillaUnoFormato2.docx
+++ b/src/assets/PlantillaUnoFormato2.docx
@@ -26,8 +26,6 @@
         </w:rPr>
         <w:t xml:space="preserve"> Vitae</w:t>
       </w:r>
-      <w:bookmarkStart w:id="0" w:name="_GoBack"/>
-      <w:bookmarkEnd w:id="0"/>
     </w:p>
     <w:p>
       <w:pPr>
@@ -789,14 +787,16 @@
         <w:jc w:val="both"/>
         <w:rPr>
           <w:rFonts w:ascii="Palatino Linotype" w:hAnsi="Palatino Linotype" w:cs="Calibri"/>
-          <w:sz w:val="22"/>
-          <w:szCs w:val="22"/>
-          <w:lang w:val="es-ES"/>
-        </w:rPr>
-      </w:pPr>
-      <w:r>
-        <w:rPr>
-          <w:rFonts w:ascii="Palatino Linotype" w:hAnsi="Palatino Linotype" w:cs="Calibri"/>
+          <w:b/>
+          <w:sz w:val="22"/>
+          <w:szCs w:val="22"/>
+          <w:lang w:val="es-ES"/>
+        </w:rPr>
+      </w:pPr>
+      <w:r>
+        <w:rPr>
+          <w:rFonts w:ascii="Palatino Linotype" w:hAnsi="Palatino Linotype" w:cs="Calibri"/>
+          <w:b/>
           <w:sz w:val="22"/>
           <w:szCs w:val="22"/>
           <w:lang w:val="es-ES"/>
@@ -806,6 +806,7 @@
       <w:r>
         <w:rPr>
           <w:rFonts w:ascii="Palatino Linotype" w:hAnsi="Palatino Linotype" w:cs="Calibri"/>
+          <w:b/>
           <w:sz w:val="22"/>
           <w:szCs w:val="22"/>
           <w:lang w:val="es-ES"/>
@@ -815,6 +816,7 @@
       <w:r>
         <w:rPr>
           <w:rFonts w:ascii="Palatino Linotype" w:hAnsi="Palatino Linotype" w:cs="Calibri"/>
+          <w:b/>
           <w:sz w:val="22"/>
           <w:szCs w:val="22"/>
           <w:lang w:val="es-ES"/>
@@ -938,14 +940,16 @@
         <w:jc w:val="both"/>
         <w:rPr>
           <w:rFonts w:ascii="Palatino Linotype" w:hAnsi="Palatino Linotype" w:cs="Calibri"/>
-          <w:sz w:val="22"/>
-          <w:szCs w:val="22"/>
-          <w:lang w:val="es-ES"/>
-        </w:rPr>
-      </w:pPr>
-      <w:r>
-        <w:rPr>
-          <w:rFonts w:ascii="Palatino Linotype" w:hAnsi="Palatino Linotype" w:cs="Calibri"/>
+          <w:b/>
+          <w:sz w:val="22"/>
+          <w:szCs w:val="22"/>
+          <w:lang w:val="es-ES"/>
+        </w:rPr>
+      </w:pPr>
+      <w:r>
+        <w:rPr>
+          <w:rFonts w:ascii="Palatino Linotype" w:hAnsi="Palatino Linotype" w:cs="Calibri"/>
+          <w:b/>
           <w:sz w:val="22"/>
           <w:szCs w:val="22"/>
           <w:lang w:val="es-ES"/>
@@ -955,6 +959,7 @@
       <w:r>
         <w:rPr>
           <w:rFonts w:ascii="Palatino Linotype" w:hAnsi="Palatino Linotype" w:cs="Calibri"/>
+          <w:b/>
           <w:sz w:val="22"/>
           <w:szCs w:val="22"/>
           <w:lang w:val="es-ES"/>
@@ -964,6 +969,7 @@
       <w:r>
         <w:rPr>
           <w:rFonts w:ascii="Palatino Linotype" w:hAnsi="Palatino Linotype" w:cs="Calibri"/>
+          <w:b/>
           <w:sz w:val="22"/>
           <w:szCs w:val="22"/>
           <w:lang w:val="es-ES"/>
@@ -1010,6 +1016,8 @@
         </w:rPr>
         <w:t>}</w:t>
       </w:r>
+      <w:bookmarkStart w:id="0" w:name="_GoBack"/>
+      <w:bookmarkEnd w:id="0"/>
     </w:p>
     <w:p>
       <w:pPr>
@@ -4621,7 +4629,7 @@
 </file>
 
 <file path=customXml/itemProps1.xml><?xml version="1.0" encoding="utf-8"?>
-<ds:datastoreItem xmlns:ds="http://schemas.openxmlformats.org/officeDocument/2006/customXml" ds:itemID="{BB4FD2A1-83CE-4224-8503-9C2832D11E94}">
+<ds:datastoreItem xmlns:ds="http://schemas.openxmlformats.org/officeDocument/2006/customXml" ds:itemID="{55B9ACDF-3D8B-4B80-A019-0556EF5C303A}">
   <ds:schemaRefs>
     <ds:schemaRef ds:uri="http://schemas.openxmlformats.org/officeDocument/2006/bibliography"/>
   </ds:schemaRefs>

</xml_diff>